<commit_message>
Perbaiki revisi IECEx_Information_Requirements yang belum dinaikkan
Dokumen ini ternyata belum pernah punya tabel Revision History sejak
dibuat, sehingga nomor revisi lupa dinaikkan meski isinya sudah
berubah substansial di commit sebelumnya. Tambahkan tabel Revision
History, bump 0.1 -> 0.2, regenerasi docx/pdf, sinkronkan ke paket.

Co-Authored-By: Claude Sonnet 5 <noreply@anthropic.com>
</commit_message>
<xml_diff>
--- a/Deliverables/IECEx_ATEX_Certification_Information_Requirements_GLD.docx
+++ b/Deliverables/IECEx_ATEX_Certification_Information_Requirements_GLD.docx
@@ -223,7 +223,7 @@
               <w:rPr>
                 <w:sz w:val="20"/>
               </w:rPr>
-              <w:t>0.1</w:t>
+              <w:t>0.2</w:t>
             </w:r>
           </w:p>
         </w:tc>
@@ -574,6 +574,197 @@
         <w:spacing w:after="80"/>
       </w:pPr>
     </w:p>
+    <w:p>
+      <w:pPr>
+        <w:spacing w:after="80"/>
+      </w:pPr>
+      <w:r>
+        <w:rPr>
+          <w:b/>
+          <w:color w:val="1A2B3D"/>
+          <w:sz w:val="23"/>
+        </w:rPr>
+        <w:t>Revision History</w:t>
+      </w:r>
+    </w:p>
+    <w:tbl>
+      <w:tblPr>
+        <w:tblStyle w:val="TableGrid"/>
+        <w:tblW w:w="0" w:type="auto"/>
+        <w:tblLook w:val="04A0" w:firstRow="1" w:lastRow="0" w:firstColumn="1" w:lastColumn="0" w:noHBand="0" w:noVBand="1"/>
+      </w:tblPr>
+      <w:tblGrid>
+        <w:gridCol w:w="1296"/>
+        <w:gridCol w:w="1872"/>
+        <w:gridCol w:w="6192"/>
+      </w:tblGrid>
+      <w:tr>
+        <w:tc>
+          <w:tcPr>
+            <w:tcW w:w="1296" w:type="dxa"/>
+            <w:shd w:val="clear" w:color="auto" w:fill="EFEFEF"/>
+          </w:tcPr>
+          <w:p>
+            <w:pPr>
+              <w:spacing w:after="40"/>
+            </w:pPr>
+            <w:r>
+              <w:rPr>
+                <w:b/>
+                <w:color w:val="4A4A4A"/>
+                <w:sz w:val="18"/>
+              </w:rPr>
+              <w:t>REVISION</w:t>
+            </w:r>
+          </w:p>
+        </w:tc>
+        <w:tc>
+          <w:tcPr>
+            <w:tcW w:w="1872" w:type="dxa"/>
+            <w:shd w:val="clear" w:color="auto" w:fill="EFEFEF"/>
+          </w:tcPr>
+          <w:p>
+            <w:pPr>
+              <w:spacing w:after="40"/>
+            </w:pPr>
+            <w:r>
+              <w:rPr>
+                <w:b/>
+                <w:color w:val="4A4A4A"/>
+                <w:sz w:val="18"/>
+              </w:rPr>
+              <w:t>DATE</w:t>
+            </w:r>
+          </w:p>
+        </w:tc>
+        <w:tc>
+          <w:tcPr>
+            <w:tcW w:w="6192" w:type="dxa"/>
+            <w:shd w:val="clear" w:color="auto" w:fill="EFEFEF"/>
+          </w:tcPr>
+          <w:p>
+            <w:pPr>
+              <w:spacing w:after="40"/>
+            </w:pPr>
+            <w:r>
+              <w:rPr>
+                <w:b/>
+                <w:color w:val="4A4A4A"/>
+                <w:sz w:val="18"/>
+              </w:rPr>
+              <w:t>DESCRIPTION</w:t>
+            </w:r>
+          </w:p>
+        </w:tc>
+      </w:tr>
+      <w:tr>
+        <w:tc>
+          <w:tcPr>
+            <w:tcW w:w="1296" w:type="dxa"/>
+          </w:tcPr>
+          <w:p>
+            <w:pPr>
+              <w:spacing w:after="40"/>
+            </w:pPr>
+            <w:r>
+              <w:rPr>
+                <w:sz w:val="19"/>
+              </w:rPr>
+              <w:t>0.1</w:t>
+            </w:r>
+          </w:p>
+        </w:tc>
+        <w:tc>
+          <w:tcPr>
+            <w:tcW w:w="1872" w:type="dxa"/>
+          </w:tcPr>
+          <w:p>
+            <w:pPr>
+              <w:spacing w:after="40"/>
+            </w:pPr>
+            <w:r>
+              <w:rPr>
+                <w:sz w:val="19"/>
+              </w:rPr>
+              <w:t>22 September 2026</w:t>
+            </w:r>
+          </w:p>
+        </w:tc>
+        <w:tc>
+          <w:tcPr>
+            <w:tcW w:w="6192" w:type="dxa"/>
+          </w:tcPr>
+          <w:p>
+            <w:pPr>
+              <w:spacing w:after="40"/>
+            </w:pPr>
+            <w:r>
+              <w:rPr>
+                <w:sz w:val="19"/>
+              </w:rPr>
+              <w:t>Initial issue — filled in against the internal working-draft template (IECEx ATEX Certification Information Requirements_Rev18092026.docx), covering all three sections of the checklist.</w:t>
+            </w:r>
+          </w:p>
+        </w:tc>
+      </w:tr>
+      <w:tr>
+        <w:tc>
+          <w:tcPr>
+            <w:tcW w:w="1296" w:type="dxa"/>
+          </w:tcPr>
+          <w:p>
+            <w:pPr>
+              <w:spacing w:after="40"/>
+            </w:pPr>
+            <w:r>
+              <w:rPr>
+                <w:sz w:val="19"/>
+              </w:rPr>
+              <w:lastRenderedPageBreak/>
+              <w:t>0.2</w:t>
+            </w:r>
+          </w:p>
+        </w:tc>
+        <w:tc>
+          <w:tcPr>
+            <w:tcW w:w="1872" w:type="dxa"/>
+          </w:tcPr>
+          <w:p>
+            <w:pPr>
+              <w:spacing w:after="40"/>
+            </w:pPr>
+            <w:r>
+              <w:rPr>
+                <w:sz w:val="19"/>
+              </w:rPr>
+              <w:t>22 September 2026</w:t>
+            </w:r>
+          </w:p>
+        </w:tc>
+        <w:tc>
+          <w:tcPr>
+            <w:tcW w:w="6192" w:type="dxa"/>
+          </w:tcPr>
+          <w:p>
+            <w:pPr>
+              <w:spacing w:after="40"/>
+            </w:pPr>
+            <w:r>
+              <w:rPr>
+                <w:sz w:val="19"/>
+              </w:rPr>
+              <w:t>Total weight corrected to 2.3 kg; IP rating confirmed as IP66; operating humidity confirmed as 10–90% RH non-condensing; cable gland confirmed as M20×1.5 (IP66-rated) — all raised to Final (Section 2.3). Power consumption rounded to 8 W. Removed the ambiguous “no plastic or PVC” parenthetical from the product description (Section 2.1) and generalized “L-bracket” to “bracket” in that same narrative sentence (the dimensioned bracket/U-bolt specification in Section 2.3 is unaffected). “GLD V2 (Version 2)” simp</w:t>
+            </w:r>
+            <w:r>
+              <w:rPr>
+                <w:sz w:val="19"/>
+              </w:rPr>
+              <w:t>lified to “GLD V2”. Layout fix: kept the Section 2.6.b BOM paragraph together across the page break.</w:t>
+            </w:r>
+          </w:p>
+        </w:tc>
+      </w:tr>
+    </w:tbl>
     <w:p>
       <w:r>
         <w:br w:type="page"/>
@@ -612,7 +803,7 @@
       <w:r>
         <w:fldChar w:fldCharType="separate"/>
       </w:r>
-      <w:hyperlink w:anchor="_Toc240981280" w:history="1">
+      <w:hyperlink w:anchor="_Toc240982221" w:history="1">
         <w:r>
           <w:rPr>
             <w:rStyle w:val="Hyperlink"/>
@@ -639,279 +830,7 @@
             <w:noProof/>
             <w:webHidden/>
           </w:rPr>
-          <w:instrText xml:space="preserve"> PAGEREF _Toc240981280 \h </w:instrText>
-        </w:r>
-        <w:r>
-          <w:rPr>
-            <w:noProof/>
-            <w:webHidden/>
-          </w:rPr>
-        </w:r>
-        <w:r>
-          <w:rPr>
-            <w:noProof/>
-            <w:webHidden/>
-          </w:rPr>
-          <w:fldChar w:fldCharType="separate"/>
-        </w:r>
-        <w:r>
-          <w:rPr>
-            <w:noProof/>
-            <w:webHidden/>
-          </w:rPr>
-          <w:t>3</w:t>
-        </w:r>
-        <w:r>
-          <w:rPr>
-            <w:noProof/>
-            <w:webHidden/>
-          </w:rPr>
-          <w:fldChar w:fldCharType="end"/>
-        </w:r>
-      </w:hyperlink>
-    </w:p>
-    <w:p>
-      <w:pPr>
-        <w:pStyle w:val="TOC2"/>
-        <w:tabs>
-          <w:tab w:val="right" w:leader="dot" w:pos="9736"/>
-        </w:tabs>
-        <w:rPr>
-          <w:noProof/>
-        </w:rPr>
-      </w:pPr>
-      <w:hyperlink w:anchor="_Toc240981281" w:history="1">
-        <w:r>
-          <w:rPr>
-            <w:rStyle w:val="Hyperlink"/>
-            <w:noProof/>
-          </w:rPr>
-          <w:t>1.1 · Application Form</w:t>
-        </w:r>
-        <w:r>
-          <w:rPr>
-            <w:noProof/>
-            <w:webHidden/>
-          </w:rPr>
-          <w:tab/>
-        </w:r>
-        <w:r>
-          <w:rPr>
-            <w:noProof/>
-            <w:webHidden/>
-          </w:rPr>
-          <w:fldChar w:fldCharType="begin"/>
-        </w:r>
-        <w:r>
-          <w:rPr>
-            <w:noProof/>
-            <w:webHidden/>
-          </w:rPr>
-          <w:instrText xml:space="preserve"> PAGEREF _Toc240981281 \h </w:instrText>
-        </w:r>
-        <w:r>
-          <w:rPr>
-            <w:noProof/>
-            <w:webHidden/>
-          </w:rPr>
-        </w:r>
-        <w:r>
-          <w:rPr>
-            <w:noProof/>
-            <w:webHidden/>
-          </w:rPr>
-          <w:fldChar w:fldCharType="separate"/>
-        </w:r>
-        <w:r>
-          <w:rPr>
-            <w:noProof/>
-            <w:webHidden/>
-          </w:rPr>
-          <w:t>3</w:t>
-        </w:r>
-        <w:r>
-          <w:rPr>
-            <w:noProof/>
-            <w:webHidden/>
-          </w:rPr>
-          <w:fldChar w:fldCharType="end"/>
-        </w:r>
-      </w:hyperlink>
-    </w:p>
-    <w:p>
-      <w:pPr>
-        <w:pStyle w:val="TOC2"/>
-        <w:tabs>
-          <w:tab w:val="right" w:leader="dot" w:pos="9736"/>
-        </w:tabs>
-        <w:rPr>
-          <w:noProof/>
-        </w:rPr>
-      </w:pPr>
-      <w:hyperlink w:anchor="_Toc240981282" w:history="1">
-        <w:r>
-          <w:rPr>
-            <w:rStyle w:val="Hyperlink"/>
-            <w:noProof/>
-          </w:rPr>
-          <w:t>1.2 · Manufacturer's Business License / Company Registration Certificate</w:t>
-        </w:r>
-        <w:r>
-          <w:rPr>
-            <w:noProof/>
-            <w:webHidden/>
-          </w:rPr>
-          <w:tab/>
-        </w:r>
-        <w:r>
-          <w:rPr>
-            <w:noProof/>
-            <w:webHidden/>
-          </w:rPr>
-          <w:fldChar w:fldCharType="begin"/>
-        </w:r>
-        <w:r>
-          <w:rPr>
-            <w:noProof/>
-            <w:webHidden/>
-          </w:rPr>
-          <w:instrText xml:space="preserve"> PAGEREF _Toc240981282 \h </w:instrText>
-        </w:r>
-        <w:r>
-          <w:rPr>
-            <w:noProof/>
-            <w:webHidden/>
-          </w:rPr>
-        </w:r>
-        <w:r>
-          <w:rPr>
-            <w:noProof/>
-            <w:webHidden/>
-          </w:rPr>
-          <w:fldChar w:fldCharType="separate"/>
-        </w:r>
-        <w:r>
-          <w:rPr>
-            <w:noProof/>
-            <w:webHidden/>
-          </w:rPr>
-          <w:t>3</w:t>
-        </w:r>
-        <w:r>
-          <w:rPr>
-            <w:noProof/>
-            <w:webHidden/>
-          </w:rPr>
-          <w:fldChar w:fldCharType="end"/>
-        </w:r>
-      </w:hyperlink>
-    </w:p>
-    <w:p>
-      <w:pPr>
-        <w:pStyle w:val="TOC2"/>
-        <w:tabs>
-          <w:tab w:val="right" w:leader="dot" w:pos="9736"/>
-        </w:tabs>
-        <w:rPr>
-          <w:noProof/>
-        </w:rPr>
-      </w:pPr>
-      <w:hyperlink w:anchor="_Toc240981283" w:history="1">
-        <w:r>
-          <w:rPr>
-            <w:rStyle w:val="Hyperlink"/>
-            <w:noProof/>
-          </w:rPr>
-          <w:t>1.3 · Manufacturer's Organizational Chart and Contact Information</w:t>
-        </w:r>
-        <w:r>
-          <w:rPr>
-            <w:noProof/>
-            <w:webHidden/>
-          </w:rPr>
-          <w:tab/>
-        </w:r>
-        <w:r>
-          <w:rPr>
-            <w:noProof/>
-            <w:webHidden/>
-          </w:rPr>
-          <w:fldChar w:fldCharType="begin"/>
-        </w:r>
-        <w:r>
-          <w:rPr>
-            <w:noProof/>
-            <w:webHidden/>
-          </w:rPr>
-          <w:instrText xml:space="preserve"> PAGEREF _Toc240981283 \h </w:instrText>
-        </w:r>
-        <w:r>
-          <w:rPr>
-            <w:noProof/>
-            <w:webHidden/>
-          </w:rPr>
-        </w:r>
-        <w:r>
-          <w:rPr>
-            <w:noProof/>
-            <w:webHidden/>
-          </w:rPr>
-          <w:fldChar w:fldCharType="separate"/>
-        </w:r>
-        <w:r>
-          <w:rPr>
-            <w:noProof/>
-            <w:webHidden/>
-          </w:rPr>
-          <w:t>3</w:t>
-        </w:r>
-        <w:r>
-          <w:rPr>
-            <w:noProof/>
-            <w:webHidden/>
-          </w:rPr>
-          <w:fldChar w:fldCharType="end"/>
-        </w:r>
-      </w:hyperlink>
-    </w:p>
-    <w:p>
-      <w:pPr>
-        <w:pStyle w:val="TOC2"/>
-        <w:tabs>
-          <w:tab w:val="right" w:leader="dot" w:pos="9736"/>
-        </w:tabs>
-        <w:rPr>
-          <w:noProof/>
-        </w:rPr>
-      </w:pPr>
-      <w:hyperlink w:anchor="_Toc240981284" w:history="1">
-        <w:r>
-          <w:rPr>
-            <w:rStyle w:val="Hyperlink"/>
-            <w:noProof/>
-          </w:rPr>
-          <w:t>1.4 · Address of Manufacturing Plant and Brief Introduction of Production Facilities</w:t>
-        </w:r>
-        <w:r>
-          <w:rPr>
-            <w:noProof/>
-            <w:webHidden/>
-          </w:rPr>
-          <w:tab/>
-        </w:r>
-        <w:r>
-          <w:rPr>
-            <w:noProof/>
-            <w:webHidden/>
-          </w:rPr>
-          <w:fldChar w:fldCharType="begin"/>
-        </w:r>
-        <w:r>
-          <w:rPr>
-            <w:noProof/>
-            <w:webHidden/>
-          </w:rPr>
-          <w:instrText xml:space="preserve"> PAGEREF _Toc240981284 \h </w:instrText>
+          <w:instrText xml:space="preserve"> PAGEREF _Toc240982221 \h </w:instrText>
         </w:r>
         <w:r>
           <w:rPr>
@@ -952,13 +871,13 @@
           <w:noProof/>
         </w:rPr>
       </w:pPr>
-      <w:hyperlink w:anchor="_Toc240981285" w:history="1">
+      <w:hyperlink w:anchor="_Toc240982222" w:history="1">
         <w:r>
           <w:rPr>
             <w:rStyle w:val="Hyperlink"/>
             <w:noProof/>
           </w:rPr>
-          <w:t>1.5 · ISO 9001 Certificate, Quality Manual, and Directory of Procedure Documents (for QAR/QAN review)</w:t>
+          <w:t>1.1 · Application Form</w:t>
         </w:r>
         <w:r>
           <w:rPr>
@@ -979,7 +898,7 @@
             <w:noProof/>
             <w:webHidden/>
           </w:rPr>
-          <w:instrText xml:space="preserve"> PAGEREF _Toc240981285 \h </w:instrText>
+          <w:instrText xml:space="preserve"> PAGEREF _Toc240982222 \h </w:instrText>
         </w:r>
         <w:r>
           <w:rPr>
@@ -1012,7 +931,7 @@
     </w:p>
     <w:p>
       <w:pPr>
-        <w:pStyle w:val="TOC1"/>
+        <w:pStyle w:val="TOC2"/>
         <w:tabs>
           <w:tab w:val="right" w:leader="dot" w:pos="9736"/>
         </w:tabs>
@@ -1020,13 +939,13 @@
           <w:noProof/>
         </w:rPr>
       </w:pPr>
-      <w:hyperlink w:anchor="_Toc240981286" w:history="1">
+      <w:hyperlink w:anchor="_Toc240982223" w:history="1">
         <w:r>
           <w:rPr>
             <w:rStyle w:val="Hyperlink"/>
             <w:noProof/>
           </w:rPr>
-          <w:t>2. Technical Documentation</w:t>
+          <w:t>1.2 · Manufacturer's Business License / Company Registration Certificate</w:t>
         </w:r>
         <w:r>
           <w:rPr>
@@ -1047,7 +966,143 @@
             <w:noProof/>
             <w:webHidden/>
           </w:rPr>
-          <w:instrText xml:space="preserve"> PAGEREF _Toc240981286 \h </w:instrText>
+          <w:instrText xml:space="preserve"> PAGEREF _Toc240982223 \h </w:instrText>
+        </w:r>
+        <w:r>
+          <w:rPr>
+            <w:noProof/>
+            <w:webHidden/>
+          </w:rPr>
+        </w:r>
+        <w:r>
+          <w:rPr>
+            <w:noProof/>
+            <w:webHidden/>
+          </w:rPr>
+          <w:fldChar w:fldCharType="separate"/>
+        </w:r>
+        <w:r>
+          <w:rPr>
+            <w:noProof/>
+            <w:webHidden/>
+          </w:rPr>
+          <w:t>4</w:t>
+        </w:r>
+        <w:r>
+          <w:rPr>
+            <w:noProof/>
+            <w:webHidden/>
+          </w:rPr>
+          <w:fldChar w:fldCharType="end"/>
+        </w:r>
+      </w:hyperlink>
+    </w:p>
+    <w:p>
+      <w:pPr>
+        <w:pStyle w:val="TOC2"/>
+        <w:tabs>
+          <w:tab w:val="right" w:leader="dot" w:pos="9736"/>
+        </w:tabs>
+        <w:rPr>
+          <w:noProof/>
+        </w:rPr>
+      </w:pPr>
+      <w:hyperlink w:anchor="_Toc240982224" w:history="1">
+        <w:r>
+          <w:rPr>
+            <w:rStyle w:val="Hyperlink"/>
+            <w:noProof/>
+          </w:rPr>
+          <w:t>1.3 · Manufacturer's Organizational Chart and Contact Information</w:t>
+        </w:r>
+        <w:r>
+          <w:rPr>
+            <w:noProof/>
+            <w:webHidden/>
+          </w:rPr>
+          <w:tab/>
+        </w:r>
+        <w:r>
+          <w:rPr>
+            <w:noProof/>
+            <w:webHidden/>
+          </w:rPr>
+          <w:fldChar w:fldCharType="begin"/>
+        </w:r>
+        <w:r>
+          <w:rPr>
+            <w:noProof/>
+            <w:webHidden/>
+          </w:rPr>
+          <w:instrText xml:space="preserve"> PAGEREF _Toc240982224 \h </w:instrText>
+        </w:r>
+        <w:r>
+          <w:rPr>
+            <w:noProof/>
+            <w:webHidden/>
+          </w:rPr>
+        </w:r>
+        <w:r>
+          <w:rPr>
+            <w:noProof/>
+            <w:webHidden/>
+          </w:rPr>
+          <w:fldChar w:fldCharType="separate"/>
+        </w:r>
+        <w:r>
+          <w:rPr>
+            <w:noProof/>
+            <w:webHidden/>
+          </w:rPr>
+          <w:t>4</w:t>
+        </w:r>
+        <w:r>
+          <w:rPr>
+            <w:noProof/>
+            <w:webHidden/>
+          </w:rPr>
+          <w:fldChar w:fldCharType="end"/>
+        </w:r>
+      </w:hyperlink>
+    </w:p>
+    <w:p>
+      <w:pPr>
+        <w:pStyle w:val="TOC2"/>
+        <w:tabs>
+          <w:tab w:val="right" w:leader="dot" w:pos="9736"/>
+        </w:tabs>
+        <w:rPr>
+          <w:noProof/>
+        </w:rPr>
+      </w:pPr>
+      <w:hyperlink w:anchor="_Toc240982225" w:history="1">
+        <w:r>
+          <w:rPr>
+            <w:rStyle w:val="Hyperlink"/>
+            <w:noProof/>
+          </w:rPr>
+          <w:t>1.4 · Address of Manufacturing Plant and Brief Introduction of Production Facilities</w:t>
+        </w:r>
+        <w:r>
+          <w:rPr>
+            <w:noProof/>
+            <w:webHidden/>
+          </w:rPr>
+          <w:tab/>
+        </w:r>
+        <w:r>
+          <w:rPr>
+            <w:noProof/>
+            <w:webHidden/>
+          </w:rPr>
+          <w:fldChar w:fldCharType="begin"/>
+        </w:r>
+        <w:r>
+          <w:rPr>
+            <w:noProof/>
+            <w:webHidden/>
+          </w:rPr>
+          <w:instrText xml:space="preserve"> PAGEREF _Toc240982225 \h </w:instrText>
         </w:r>
         <w:r>
           <w:rPr>
@@ -1088,13 +1143,13 @@
           <w:noProof/>
         </w:rPr>
       </w:pPr>
-      <w:hyperlink w:anchor="_Toc240981287" w:history="1">
+      <w:hyperlink w:anchor="_Toc240982226" w:history="1">
         <w:r>
           <w:rPr>
             <w:rStyle w:val="Hyperlink"/>
             <w:noProof/>
           </w:rPr>
-          <w:t>2.1 · Detailed Product Description</w:t>
+          <w:t>1.5 · ISO 9001 Certificate, Quality Manual, and Directory of Procedure Documents (for QAR/QAN review)</w:t>
         </w:r>
         <w:r>
           <w:rPr>
@@ -1115,7 +1170,7 @@
             <w:noProof/>
             <w:webHidden/>
           </w:rPr>
-          <w:instrText xml:space="preserve"> PAGEREF _Toc240981287 \h </w:instrText>
+          <w:instrText xml:space="preserve"> PAGEREF _Toc240982226 \h </w:instrText>
         </w:r>
         <w:r>
           <w:rPr>
@@ -1148,7 +1203,7 @@
     </w:p>
     <w:p>
       <w:pPr>
-        <w:pStyle w:val="TOC2"/>
+        <w:pStyle w:val="TOC1"/>
         <w:tabs>
           <w:tab w:val="right" w:leader="dot" w:pos="9736"/>
         </w:tabs>
@@ -1156,13 +1211,13 @@
           <w:noProof/>
         </w:rPr>
       </w:pPr>
-      <w:hyperlink w:anchor="_Toc240981288" w:history="1">
+      <w:hyperlink w:anchor="_Toc240982227" w:history="1">
         <w:r>
           <w:rPr>
             <w:rStyle w:val="Hyperlink"/>
             <w:noProof/>
           </w:rPr>
-          <w:t>2.2 · Product Name, Model, and Specification List</w:t>
+          <w:t>2. Technical Documentation</w:t>
         </w:r>
         <w:r>
           <w:rPr>
@@ -1183,75 +1238,7 @@
             <w:noProof/>
             <w:webHidden/>
           </w:rPr>
-          <w:instrText xml:space="preserve"> PAGEREF _Toc240981288 \h </w:instrText>
-        </w:r>
-        <w:r>
-          <w:rPr>
-            <w:noProof/>
-            <w:webHidden/>
-          </w:rPr>
-        </w:r>
-        <w:r>
-          <w:rPr>
-            <w:noProof/>
-            <w:webHidden/>
-          </w:rPr>
-          <w:fldChar w:fldCharType="separate"/>
-        </w:r>
-        <w:r>
-          <w:rPr>
-            <w:noProof/>
-            <w:webHidden/>
-          </w:rPr>
-          <w:t>5</w:t>
-        </w:r>
-        <w:r>
-          <w:rPr>
-            <w:noProof/>
-            <w:webHidden/>
-          </w:rPr>
-          <w:fldChar w:fldCharType="end"/>
-        </w:r>
-      </w:hyperlink>
-    </w:p>
-    <w:p>
-      <w:pPr>
-        <w:pStyle w:val="TOC2"/>
-        <w:tabs>
-          <w:tab w:val="right" w:leader="dot" w:pos="9736"/>
-        </w:tabs>
-        <w:rPr>
-          <w:noProof/>
-        </w:rPr>
-      </w:pPr>
-      <w:hyperlink w:anchor="_Toc240981289" w:history="1">
-        <w:r>
-          <w:rPr>
-            <w:rStyle w:val="Hyperlink"/>
-            <w:noProof/>
-          </w:rPr>
-          <w:t>2.3 · Complete and Clear Functional Description and Technical Parameters (Electrical, Mechanical, etc.)</w:t>
-        </w:r>
-        <w:r>
-          <w:rPr>
-            <w:noProof/>
-            <w:webHidden/>
-          </w:rPr>
-          <w:tab/>
-        </w:r>
-        <w:r>
-          <w:rPr>
-            <w:noProof/>
-            <w:webHidden/>
-          </w:rPr>
-          <w:fldChar w:fldCharType="begin"/>
-        </w:r>
-        <w:r>
-          <w:rPr>
-            <w:noProof/>
-            <w:webHidden/>
-          </w:rPr>
-          <w:instrText xml:space="preserve"> PAGEREF _Toc240981289 \h </w:instrText>
+          <w:instrText xml:space="preserve"> PAGEREF _Toc240982227 \h </w:instrText>
         </w:r>
         <w:r>
           <w:rPr>
@@ -1292,13 +1279,13 @@
           <w:noProof/>
         </w:rPr>
       </w:pPr>
-      <w:hyperlink w:anchor="_Toc240981290" w:history="1">
+      <w:hyperlink w:anchor="_Toc240982228" w:history="1">
         <w:r>
           <w:rPr>
             <w:rStyle w:val="Hyperlink"/>
             <w:noProof/>
           </w:rPr>
-          <w:t>2.4 · Clear Product Photos (Overall and Key Components)</w:t>
+          <w:t>2.1 · Detailed Product Description</w:t>
         </w:r>
         <w:r>
           <w:rPr>
@@ -1319,7 +1306,143 @@
             <w:noProof/>
             <w:webHidden/>
           </w:rPr>
-          <w:instrText xml:space="preserve"> PAGEREF _Toc240981290 \h </w:instrText>
+          <w:instrText xml:space="preserve"> PAGEREF _Toc240982228 \h </w:instrText>
+        </w:r>
+        <w:r>
+          <w:rPr>
+            <w:noProof/>
+            <w:webHidden/>
+          </w:rPr>
+        </w:r>
+        <w:r>
+          <w:rPr>
+            <w:noProof/>
+            <w:webHidden/>
+          </w:rPr>
+          <w:fldChar w:fldCharType="separate"/>
+        </w:r>
+        <w:r>
+          <w:rPr>
+            <w:noProof/>
+            <w:webHidden/>
+          </w:rPr>
+          <w:t>6</w:t>
+        </w:r>
+        <w:r>
+          <w:rPr>
+            <w:noProof/>
+            <w:webHidden/>
+          </w:rPr>
+          <w:fldChar w:fldCharType="end"/>
+        </w:r>
+      </w:hyperlink>
+    </w:p>
+    <w:p>
+      <w:pPr>
+        <w:pStyle w:val="TOC2"/>
+        <w:tabs>
+          <w:tab w:val="right" w:leader="dot" w:pos="9736"/>
+        </w:tabs>
+        <w:rPr>
+          <w:noProof/>
+        </w:rPr>
+      </w:pPr>
+      <w:hyperlink w:anchor="_Toc240982229" w:history="1">
+        <w:r>
+          <w:rPr>
+            <w:rStyle w:val="Hyperlink"/>
+            <w:noProof/>
+          </w:rPr>
+          <w:t>2.2 · Product Name, Model, and Specification List</w:t>
+        </w:r>
+        <w:r>
+          <w:rPr>
+            <w:noProof/>
+            <w:webHidden/>
+          </w:rPr>
+          <w:tab/>
+        </w:r>
+        <w:r>
+          <w:rPr>
+            <w:noProof/>
+            <w:webHidden/>
+          </w:rPr>
+          <w:fldChar w:fldCharType="begin"/>
+        </w:r>
+        <w:r>
+          <w:rPr>
+            <w:noProof/>
+            <w:webHidden/>
+          </w:rPr>
+          <w:instrText xml:space="preserve"> PAGEREF _Toc240982229 \h </w:instrText>
+        </w:r>
+        <w:r>
+          <w:rPr>
+            <w:noProof/>
+            <w:webHidden/>
+          </w:rPr>
+        </w:r>
+        <w:r>
+          <w:rPr>
+            <w:noProof/>
+            <w:webHidden/>
+          </w:rPr>
+          <w:fldChar w:fldCharType="separate"/>
+        </w:r>
+        <w:r>
+          <w:rPr>
+            <w:noProof/>
+            <w:webHidden/>
+          </w:rPr>
+          <w:t>6</w:t>
+        </w:r>
+        <w:r>
+          <w:rPr>
+            <w:noProof/>
+            <w:webHidden/>
+          </w:rPr>
+          <w:fldChar w:fldCharType="end"/>
+        </w:r>
+      </w:hyperlink>
+    </w:p>
+    <w:p>
+      <w:pPr>
+        <w:pStyle w:val="TOC2"/>
+        <w:tabs>
+          <w:tab w:val="right" w:leader="dot" w:pos="9736"/>
+        </w:tabs>
+        <w:rPr>
+          <w:noProof/>
+        </w:rPr>
+      </w:pPr>
+      <w:hyperlink w:anchor="_Toc240982230" w:history="1">
+        <w:r>
+          <w:rPr>
+            <w:rStyle w:val="Hyperlink"/>
+            <w:noProof/>
+          </w:rPr>
+          <w:t>2.3 · Complete and Clear Functional Description and Technical Parameters (Electrical, Mechanical, etc.)</w:t>
+        </w:r>
+        <w:r>
+          <w:rPr>
+            <w:noProof/>
+            <w:webHidden/>
+          </w:rPr>
+          <w:tab/>
+        </w:r>
+        <w:r>
+          <w:rPr>
+            <w:noProof/>
+            <w:webHidden/>
+          </w:rPr>
+          <w:fldChar w:fldCharType="begin"/>
+        </w:r>
+        <w:r>
+          <w:rPr>
+            <w:noProof/>
+            <w:webHidden/>
+          </w:rPr>
+          <w:instrText xml:space="preserve"> PAGEREF _Toc240982230 \h </w:instrText>
         </w:r>
         <w:r>
           <w:rPr>
@@ -1360,13 +1483,13 @@
           <w:noProof/>
         </w:rPr>
       </w:pPr>
-      <w:hyperlink w:anchor="_Toc240981291" w:history="1">
+      <w:hyperlink w:anchor="_Toc240982231" w:history="1">
         <w:r>
           <w:rPr>
             <w:rStyle w:val="Hyperlink"/>
             <w:noProof/>
           </w:rPr>
-          <w:t>2.5 · Description of Intended Use and Installation Environment</w:t>
+          <w:t>2.4 · Clear Product Photos (Overall and Key Components)</w:t>
         </w:r>
         <w:r>
           <w:rPr>
@@ -1387,7 +1510,7 @@
             <w:noProof/>
             <w:webHidden/>
           </w:rPr>
-          <w:instrText xml:space="preserve"> PAGEREF _Toc240981291 \h </w:instrText>
+          <w:instrText xml:space="preserve"> PAGEREF _Toc240982231 \h </w:instrText>
         </w:r>
         <w:r>
           <w:rPr>
@@ -1428,13 +1551,13 @@
           <w:noProof/>
         </w:rPr>
       </w:pPr>
-      <w:hyperlink w:anchor="_Toc240981292" w:history="1">
+      <w:hyperlink w:anchor="_Toc240982232" w:history="1">
         <w:r>
           <w:rPr>
             <w:rStyle w:val="Hyperlink"/>
             <w:noProof/>
           </w:rPr>
-          <w:t>2.6 · Design and Manufacturing Information</w:t>
+          <w:t>2.5 · Description of Intended Use and Installation Environment</w:t>
         </w:r>
         <w:r>
           <w:rPr>
@@ -1455,7 +1578,7 @@
             <w:noProof/>
             <w:webHidden/>
           </w:rPr>
-          <w:instrText xml:space="preserve"> PAGEREF _Toc240981292 \h </w:instrText>
+          <w:instrText xml:space="preserve"> PAGEREF _Toc240982232 \h </w:instrText>
         </w:r>
         <w:r>
           <w:rPr>
@@ -1488,6 +1611,74 @@
     </w:p>
     <w:p>
       <w:pPr>
+        <w:pStyle w:val="TOC2"/>
+        <w:tabs>
+          <w:tab w:val="right" w:leader="dot" w:pos="9736"/>
+        </w:tabs>
+        <w:rPr>
+          <w:noProof/>
+        </w:rPr>
+      </w:pPr>
+      <w:hyperlink w:anchor="_Toc240982233" w:history="1">
+        <w:r>
+          <w:rPr>
+            <w:rStyle w:val="Hyperlink"/>
+            <w:noProof/>
+          </w:rPr>
+          <w:t>2.6 · Design and Manufacturing Information</w:t>
+        </w:r>
+        <w:r>
+          <w:rPr>
+            <w:noProof/>
+            <w:webHidden/>
+          </w:rPr>
+          <w:tab/>
+        </w:r>
+        <w:r>
+          <w:rPr>
+            <w:noProof/>
+            <w:webHidden/>
+          </w:rPr>
+          <w:fldChar w:fldCharType="begin"/>
+        </w:r>
+        <w:r>
+          <w:rPr>
+            <w:noProof/>
+            <w:webHidden/>
+          </w:rPr>
+          <w:instrText xml:space="preserve"> PAGEREF _Toc240982233 \h </w:instrText>
+        </w:r>
+        <w:r>
+          <w:rPr>
+            <w:noProof/>
+            <w:webHidden/>
+          </w:rPr>
+        </w:r>
+        <w:r>
+          <w:rPr>
+            <w:noProof/>
+            <w:webHidden/>
+          </w:rPr>
+          <w:fldChar w:fldCharType="separate"/>
+        </w:r>
+        <w:r>
+          <w:rPr>
+            <w:noProof/>
+            <w:webHidden/>
+          </w:rPr>
+          <w:t>10</w:t>
+        </w:r>
+        <w:r>
+          <w:rPr>
+            <w:noProof/>
+            <w:webHidden/>
+          </w:rPr>
+          <w:fldChar w:fldCharType="end"/>
+        </w:r>
+      </w:hyperlink>
+    </w:p>
+    <w:p>
+      <w:pPr>
         <w:pStyle w:val="TOC1"/>
         <w:tabs>
           <w:tab w:val="right" w:leader="dot" w:pos="9736"/>
@@ -1496,7 +1687,7 @@
           <w:noProof/>
         </w:rPr>
       </w:pPr>
-      <w:hyperlink w:anchor="_Toc240981293" w:history="1">
+      <w:hyperlink w:anchor="_Toc240982234" w:history="1">
         <w:r>
           <w:rPr>
             <w:rStyle w:val="Hyperlink"/>
@@ -1523,7 +1714,7 @@
             <w:noProof/>
             <w:webHidden/>
           </w:rPr>
-          <w:instrText xml:space="preserve"> PAGEREF _Toc240981293 \h </w:instrText>
+          <w:instrText xml:space="preserve"> PAGEREF _Toc240982234 \h </w:instrText>
         </w:r>
         <w:r>
           <w:rPr>
@@ -1543,7 +1734,7 @@
             <w:noProof/>
             <w:webHidden/>
           </w:rPr>
-          <w:t>16</w:t>
+          <w:t>17</w:t>
         </w:r>
         <w:r>
           <w:rPr>
@@ -1564,7 +1755,7 @@
           <w:noProof/>
         </w:rPr>
       </w:pPr>
-      <w:hyperlink w:anchor="_Toc240981294" w:history="1">
+      <w:hyperlink w:anchor="_Toc240982235" w:history="1">
         <w:r>
           <w:rPr>
             <w:rStyle w:val="Hyperlink"/>
@@ -1591,7 +1782,7 @@
             <w:noProof/>
             <w:webHidden/>
           </w:rPr>
-          <w:instrText xml:space="preserve"> PAGEREF _Toc240981294 \h </w:instrText>
+          <w:instrText xml:space="preserve"> PAGEREF _Toc240982235 \h </w:instrText>
         </w:r>
         <w:r>
           <w:rPr>
@@ -1611,7 +1802,7 @@
             <w:noProof/>
             <w:webHidden/>
           </w:rPr>
-          <w:t>16</w:t>
+          <w:t>17</w:t>
         </w:r>
         <w:r>
           <w:rPr>
@@ -1632,7 +1823,7 @@
           <w:noProof/>
         </w:rPr>
       </w:pPr>
-      <w:hyperlink w:anchor="_Toc240981295" w:history="1">
+      <w:hyperlink w:anchor="_Toc240982236" w:history="1">
         <w:r>
           <w:rPr>
             <w:rStyle w:val="Hyperlink"/>
@@ -1659,7 +1850,7 @@
             <w:noProof/>
             <w:webHidden/>
           </w:rPr>
-          <w:instrText xml:space="preserve"> PAGEREF _Toc240981295 \h </w:instrText>
+          <w:instrText xml:space="preserve"> PAGEREF _Toc240982236 \h </w:instrText>
         </w:r>
         <w:r>
           <w:rPr>
@@ -1679,7 +1870,7 @@
             <w:noProof/>
             <w:webHidden/>
           </w:rPr>
-          <w:t>16</w:t>
+          <w:t>17</w:t>
         </w:r>
         <w:r>
           <w:rPr>
@@ -1704,7 +1895,7 @@
       <w:pPr>
         <w:pStyle w:val="Heading1"/>
       </w:pPr>
-      <w:bookmarkStart w:id="0" w:name="_Toc240981280"/>
+      <w:bookmarkStart w:id="0" w:name="_Toc240982221"/>
       <w:r>
         <w:lastRenderedPageBreak/>
         <w:t>1. Basic Information (Application and Organization)</w:t>
@@ -1725,7 +1916,7 @@
       <w:pPr>
         <w:pStyle w:val="Heading2"/>
       </w:pPr>
-      <w:bookmarkStart w:id="1" w:name="_Toc240981281"/>
+      <w:bookmarkStart w:id="1" w:name="_Toc240982222"/>
       <w:r>
         <w:t>1.1 · Application Form</w:t>
       </w:r>
@@ -1761,7 +1952,7 @@
       <w:pPr>
         <w:pStyle w:val="Heading2"/>
       </w:pPr>
-      <w:bookmarkStart w:id="2" w:name="_Toc240981282"/>
+      <w:bookmarkStart w:id="2" w:name="_Toc240982223"/>
       <w:r>
         <w:t>1.2 · Manufacturer's Business License / Company Registration Certificate</w:t>
       </w:r>
@@ -2153,7 +2344,7 @@
       <w:pPr>
         <w:pStyle w:val="Heading2"/>
       </w:pPr>
-      <w:bookmarkStart w:id="3" w:name="_Toc240981283"/>
+      <w:bookmarkStart w:id="3" w:name="_Toc240982224"/>
       <w:r>
         <w:t>1.3 · Manufacturer's Organizational Chart and Contact Information</w:t>
       </w:r>
@@ -2361,7 +2552,7 @@
       <w:pPr>
         <w:pStyle w:val="Heading2"/>
       </w:pPr>
-      <w:bookmarkStart w:id="4" w:name="_Toc240981284"/>
+      <w:bookmarkStart w:id="4" w:name="_Toc240982225"/>
       <w:r>
         <w:t>1.4 · Address of Manufacturing Plant and Brief Introduction of Production Facilities</w:t>
       </w:r>
@@ -2605,7 +2796,7 @@
       <w:pPr>
         <w:pStyle w:val="Heading2"/>
       </w:pPr>
-      <w:bookmarkStart w:id="5" w:name="_Toc240981285"/>
+      <w:bookmarkStart w:id="5" w:name="_Toc240982226"/>
       <w:r>
         <w:t>1.5 · ISO 9001 Certificate, Quality Manual, and Directory of Procedure Documents (for QAR/QAN review)</w:t>
       </w:r>
@@ -2646,7 +2837,7 @@
       <w:pPr>
         <w:pStyle w:val="Heading1"/>
       </w:pPr>
-      <w:bookmarkStart w:id="6" w:name="_Toc240981286"/>
+      <w:bookmarkStart w:id="6" w:name="_Toc240982227"/>
       <w:r>
         <w:lastRenderedPageBreak/>
         <w:t>2. Technical Documentation</w:t>
@@ -2657,7 +2848,7 @@
       <w:pPr>
         <w:pStyle w:val="Heading2"/>
       </w:pPr>
-      <w:bookmarkStart w:id="7" w:name="_Toc240981287"/>
+      <w:bookmarkStart w:id="7" w:name="_Toc240982228"/>
       <w:r>
         <w:t>2.1 · Detailed Product Description</w:t>
       </w:r>
@@ -2729,7 +2920,7 @@
       <w:pPr>
         <w:pStyle w:val="Heading2"/>
       </w:pPr>
-      <w:bookmarkStart w:id="8" w:name="_Toc240981288"/>
+      <w:bookmarkStart w:id="8" w:name="_Toc240982229"/>
       <w:r>
         <w:t>2.2 · Product Name, Model, and Specification List</w:t>
       </w:r>
@@ -3206,7 +3397,7 @@
       <w:pPr>
         <w:pStyle w:val="Heading2"/>
       </w:pPr>
-      <w:bookmarkStart w:id="9" w:name="_Toc240981289"/>
+      <w:bookmarkStart w:id="9" w:name="_Toc240982230"/>
       <w:r>
         <w:lastRenderedPageBreak/>
         <w:t>2.3 · Complete and Clear Functional Description and Technical Parameters (Electrical, Mechanical, etc.)</w:t>
@@ -4806,7 +4997,7 @@
       <w:pPr>
         <w:pStyle w:val="Heading2"/>
       </w:pPr>
-      <w:bookmarkStart w:id="10" w:name="_Toc240981290"/>
+      <w:bookmarkStart w:id="10" w:name="_Toc240982231"/>
       <w:r>
         <w:t>2.4 · Clear Product Photos (Overall and Key Components)</w:t>
       </w:r>
@@ -4827,7 +5018,7 @@
         </w:rPr>
         <w:lastRenderedPageBreak/>
         <w:drawing>
-          <wp:inline distT="0" distB="0" distL="0" distR="0" wp14:anchorId="6006B1F2" wp14:editId="7BE5881F">
+          <wp:inline distT="0" distB="0" distL="0" distR="0" wp14:anchorId="7863425D" wp14:editId="12F5F00F">
             <wp:extent cx="1987074" cy="3291840"/>
             <wp:effectExtent l="0" t="0" r="0" b="0"/>
             <wp:docPr id="1" name="Picture 1"/>
@@ -4886,7 +5077,7 @@
           <w:noProof/>
         </w:rPr>
         <w:drawing>
-          <wp:inline distT="0" distB="0" distL="0" distR="0" wp14:anchorId="2FA40D17" wp14:editId="439700B3">
+          <wp:inline distT="0" distB="0" distL="0" distR="0" wp14:anchorId="0007361C" wp14:editId="2FB38EAA">
             <wp:extent cx="2468880" cy="3291840"/>
             <wp:effectExtent l="0" t="0" r="0" b="0"/>
             <wp:docPr id="2" name="Picture 2"/>
@@ -4940,7 +5131,7 @@
       <w:pPr>
         <w:pStyle w:val="Heading2"/>
       </w:pPr>
-      <w:bookmarkStart w:id="11" w:name="_Toc240981291"/>
+      <w:bookmarkStart w:id="11" w:name="_Toc240982232"/>
       <w:r>
         <w:t>2.5 · Description of Intended Use and Installation Environment</w:t>
       </w:r>
@@ -5257,7 +5448,7 @@
       <w:pPr>
         <w:pStyle w:val="Heading2"/>
       </w:pPr>
-      <w:bookmarkStart w:id="12" w:name="_Toc240981292"/>
+      <w:bookmarkStart w:id="12" w:name="_Toc240982233"/>
       <w:r>
         <w:t>2.6 · Design and Manufacturing Information</w:t>
       </w:r>
@@ -5285,7 +5476,7 @@
           <w:noProof/>
         </w:rPr>
         <w:drawing>
-          <wp:inline distT="0" distB="0" distL="0" distR="0" wp14:anchorId="1302A899" wp14:editId="680AB9B1">
+          <wp:inline distT="0" distB="0" distL="0" distR="0" wp14:anchorId="1674D5F8" wp14:editId="1B4153C7">
             <wp:extent cx="5486400" cy="3657600"/>
             <wp:effectExtent l="0" t="0" r="0" b="0"/>
             <wp:docPr id="3" name="Picture 3"/>
@@ -5345,7 +5536,7 @@
         </w:rPr>
         <w:lastRenderedPageBreak/>
         <w:drawing>
-          <wp:inline distT="0" distB="0" distL="0" distR="0" wp14:anchorId="7E829968" wp14:editId="73443060">
+          <wp:inline distT="0" distB="0" distL="0" distR="0" wp14:anchorId="3437B41D" wp14:editId="58058690">
             <wp:extent cx="4188616" cy="4206240"/>
             <wp:effectExtent l="0" t="0" r="0" b="0"/>
             <wp:docPr id="4" name="Picture 4"/>
@@ -5410,7 +5601,7 @@
         </w:rPr>
         <w:lastRenderedPageBreak/>
         <w:drawing>
-          <wp:inline distT="0" distB="0" distL="0" distR="0" wp14:anchorId="1A00CDFC" wp14:editId="2BEB00CF">
+          <wp:inline distT="0" distB="0" distL="0" distR="0" wp14:anchorId="67082DD5" wp14:editId="3FD33752">
             <wp:extent cx="5669280" cy="3847707"/>
             <wp:effectExtent l="0" t="0" r="0" b="0"/>
             <wp:docPr id="5" name="Picture 5"/>
@@ -5474,7 +5665,7 @@
           <w:noProof/>
         </w:rPr>
         <w:drawing>
-          <wp:inline distT="0" distB="0" distL="0" distR="0" wp14:anchorId="718ACAE1" wp14:editId="74961717">
+          <wp:inline distT="0" distB="0" distL="0" distR="0" wp14:anchorId="24FE10B2" wp14:editId="41D33037">
             <wp:extent cx="5669280" cy="3188136"/>
             <wp:effectExtent l="0" t="0" r="0" b="0"/>
             <wp:docPr id="6" name="Picture 6"/>
@@ -5539,7 +5730,7 @@
           <w:noProof/>
         </w:rPr>
         <w:drawing>
-          <wp:inline distT="0" distB="0" distL="0" distR="0" wp14:anchorId="3D00C936" wp14:editId="62340032">
+          <wp:inline distT="0" distB="0" distL="0" distR="0" wp14:anchorId="5DED869E" wp14:editId="7C525707">
             <wp:extent cx="5486400" cy="3875980"/>
             <wp:effectExtent l="0" t="0" r="0" b="0"/>
             <wp:docPr id="7" name="Picture 7"/>
@@ -6328,7 +6519,7 @@
       <w:pPr>
         <w:pStyle w:val="Heading1"/>
       </w:pPr>
-      <w:bookmarkStart w:id="13" w:name="_Toc240981293"/>
+      <w:bookmarkStart w:id="13" w:name="_Toc240982234"/>
       <w:r>
         <w:lastRenderedPageBreak/>
         <w:t>3. Sample Information</w:t>
@@ -6339,7 +6530,7 @@
       <w:pPr>
         <w:pStyle w:val="Heading2"/>
       </w:pPr>
-      <w:bookmarkStart w:id="14" w:name="_Toc240981294"/>
+      <w:bookmarkStart w:id="14" w:name="_Toc240982235"/>
       <w:r>
         <w:t>3.1 · Model, Serial Number, and Status of the Sample</w:t>
       </w:r>
@@ -6375,7 +6566,7 @@
       <w:pPr>
         <w:pStyle w:val="Heading2"/>
       </w:pPr>
-      <w:bookmarkStart w:id="15" w:name="_Toc240981295"/>
+      <w:bookmarkStart w:id="15" w:name="_Toc240982236"/>
       <w:r>
         <w:t>3.2 · Necessary Test Fixtures or Auxiliary Equipment</w:t>
       </w:r>
@@ -6834,7 +7025,7 @@
         <w:color w:val="4A4A4A"/>
         <w:sz w:val="16"/>
       </w:rPr>
-      <w:t>LGU/GLD/IECEX-CIR/2026-001  ·  Rev. 0.1</w:t>
+      <w:t>LGU/GLD/IECEX-CIR/2026-001  ·  Rev. 0.2</w:t>
     </w:r>
     <w:r>
       <w:rPr>
@@ -7141,31 +7332,31 @@
       </w:rPr>
     </w:lvl>
   </w:abstractNum>
-  <w:num w:numId="1" w16cid:durableId="1578518117">
+  <w:num w:numId="1" w16cid:durableId="1957104601">
     <w:abstractNumId w:val="8"/>
   </w:num>
-  <w:num w:numId="2" w16cid:durableId="1182476051">
+  <w:num w:numId="2" w16cid:durableId="722757962">
     <w:abstractNumId w:val="6"/>
   </w:num>
-  <w:num w:numId="3" w16cid:durableId="1028601474">
+  <w:num w:numId="3" w16cid:durableId="1896351776">
     <w:abstractNumId w:val="5"/>
   </w:num>
-  <w:num w:numId="4" w16cid:durableId="1474181133">
+  <w:num w:numId="4" w16cid:durableId="23292484">
     <w:abstractNumId w:val="4"/>
   </w:num>
-  <w:num w:numId="5" w16cid:durableId="373501705">
+  <w:num w:numId="5" w16cid:durableId="791286258">
     <w:abstractNumId w:val="7"/>
   </w:num>
-  <w:num w:numId="6" w16cid:durableId="1912156929">
+  <w:num w:numId="6" w16cid:durableId="13001293">
     <w:abstractNumId w:val="3"/>
   </w:num>
-  <w:num w:numId="7" w16cid:durableId="397360662">
+  <w:num w:numId="7" w16cid:durableId="60101637">
     <w:abstractNumId w:val="2"/>
   </w:num>
-  <w:num w:numId="8" w16cid:durableId="2012559780">
+  <w:num w:numId="8" w16cid:durableId="2082943224">
     <w:abstractNumId w:val="1"/>
   </w:num>
-  <w:num w:numId="9" w16cid:durableId="484589147">
+  <w:num w:numId="9" w16cid:durableId="1670519224">
     <w:abstractNumId w:val="0"/>
   </w:num>
 </w:numbering>
@@ -18587,7 +18778,7 @@
     <w:autoRedefine/>
     <w:uiPriority w:val="39"/>
     <w:unhideWhenUsed/>
-    <w:rsid w:val="00DB3F07"/>
+    <w:rsid w:val="00B85952"/>
     <w:pPr>
       <w:spacing w:after="100"/>
     </w:pPr>
@@ -18599,7 +18790,7 @@
     <w:autoRedefine/>
     <w:uiPriority w:val="39"/>
     <w:unhideWhenUsed/>
-    <w:rsid w:val="00DB3F07"/>
+    <w:rsid w:val="00B85952"/>
     <w:pPr>
       <w:spacing w:after="100"/>
       <w:ind w:left="210"/>
@@ -18610,7 +18801,7 @@
     <w:basedOn w:val="DefaultParagraphFont"/>
     <w:uiPriority w:val="99"/>
     <w:unhideWhenUsed/>
-    <w:rsid w:val="00DB3F07"/>
+    <w:rsid w:val="00B85952"/>
     <w:rPr>
       <w:color w:val="0000FF" w:themeColor="hyperlink"/>
       <w:u w:val="single"/>

</xml_diff>